<commit_message>
court(oklacrimapp): amicus brief gated on master's model (fb-595.54.61)
Engines regenerated; the URL, sign and heading-keep rules of fb-595.54.82 close the pass-1 blockers. latex and docx
break every line where typst does; tier 1 0 failed on every engine.

Co-Authored-By: Claude Opus 5.5 <noreply@anthropic.com>
</commit_message>
<xml_diff>
--- a/courts/tenth-circuit/oklahoma/state/court-of-criminal-appeals/amicus-brief/usage/OUTPUT-amicus-brief.docx
+++ b/courts/tenth-circuit/oklahoma/state/court-of-criminal-appeals/amicus-brief/usage/OUTPUT-amicus-brief.docx
@@ -1892,15 +1892,15 @@
         <w:pStyle w:val="BodyText"/>
       </w:pPr>
       <w:r>
-        <w:t xml:space="preserve">Holtzclaw’s trial began on November 2, 2015, TR 4, but did not take place in a vacuum. During the preceding 18 months, racially charged civil unrest wracked Ferguson, Mo., Baltimore, Md., and other cities around the country, after police officers involved in the use of physical force against African-Americans, sometimes lethally, either were not charged or were charged and acquitted. See Shannon Luibrand, “How a Death in Ferguson sparked a movement in America,” (Aug. 7, 2015), available at http://www.cbsnews.com/​news/​how-the-black-lives- matter-movement-changed-america-one-year-later/ (accessed Feb. 20, 2017).2 These incidents See Colin Starger, “Fifty Years Before Brady,” 37 CHAMPION 34 (May 2013). This Court can take judicial notice of a matter of common knowledge within the jurisdiction of the court (though it does not have to be universally known) and settled beyond doubt. Linscome v. State, 1978 OK CR 95, 584 P.2d 1349, 1350, citing Frazier v. State, 1953 OK CR 1, 267 P.2d 155. Certainly, the heightened state of tensions surrounding police and the Black Lives Matter gave rise to Black Lives Matter and other such movements, pushing the notion that police systemically abuse African-Americans, and that “Ferguson is everywhere.” Id. But despite analyses by serious academics debunking those claims, see Heather MacDonald, The War on Cops: How the New Attack on Law and Order Makes Everyone Less Safe (Encounter Books 2016), the unrest spread by BLM’s narrative did not go unnoticed among politically elected prosecutors.</w:t>
-      </w:r>
-    </w:p>
-    <w:p>
-      <w:pPr>
-        <w:pStyle w:val="BodyText"/>
-      </w:pPr>
-      <w:r>
-        <w:t xml:space="preserve">In many instances, those officials responded to police incidents involving African- Americans by hastily charging the officer(s), in an effort to head off mob-fueled rioting. Luibrand, supra (“But just last week, a prosecutor was quick to charge a Univ. of Cincinnati police officer with the death of Samuel DuBose during a traffic stop in Ohio”); see also Sheryl Gay Stolberg and Alan Blinder, “Marilyn Mosby, Prosecutor in Freddie Gray Case, Takes a Stand and Calms a Troubled City,” The New York Times (May 1, 2015), available at https://www.nytimes.com/2015/05/02/​us/​marilyn-mosby-prosecutor-in-freddie-gray-case-seen- as-tough-on-police-misconduct.html (accessed Feb. 20, 2017) (prosecutor announces charges against six Baltimore police officers less than two weeks after death of Freddie Gray and ensuing riots). Though such prosecutors appeased the mob and achieved transient political gain through the sacrifice of individual due-process rights, id., most of their ill-advised rushes to judgment culminated in acquittals and dropped charges. See, e.g., Sheryl Gay Stolberg and Jess Bidgood, “All Charges Dropped Against Baltimore Officers in Freddie Gray Case,” The New York Times (July 27, 2016), available at https://www.nytimes.com/2016/07/28/​us/​charges-dropped-against</w:t>
+        <w:t xml:space="preserve">Holtzclaw’s trial began on November 2, 2015, TR 4, but did not take place in a vacuum. During the preceding 18 months, racially charged civil unrest wracked Ferguson, Mo., Baltimore, Md., and other cities around the country, after police officers involved in the use of physical force against African-Americans, sometimes lethally, either were not charged or were charged and acquitted. See Shannon Luibrand, “How a Death in Ferguson sparked a movement in America,” (Aug. 7, 2015), available at http://​www.​cbsnews.​com/​news/​how-​the-​black-​lives- matter-movement-changed-america-one-year-later/ (accessed Feb. 20, 2017).2 These incidents See Colin Starger, “Fifty Years Before Brady,” 37 CHAMPION 34 (May 2013). This Court can take judicial notice of a matter of common knowledge within the jurisdiction of the court (though it does not have to be universally known) and settled beyond doubt. Linscome v. State, 1978 OK CR 95, 584 P.2d 1349, 1350, citing Frazier v. State, 1953 OK CR 1, 267 P.2d 155. Certainly, the heightened state of tensions surrounding police and the Black Lives Matter gave rise to Black Lives Matter and other such movements, pushing the notion that police systemically abuse African-Americans, and that “Ferguson is everywhere.” Id. But despite analyses by serious academics debunking those claims, see Heather MacDonald, The War on Cops: How the New Attack on Law and Order Makes Everyone Less Safe (Encounter Books 2016), the unrest spread by BLM’s narrative did not go unnoticed among politically elected prosecutors.</w:t>
+      </w:r>
+    </w:p>
+    <w:p>
+      <w:pPr>
+        <w:pStyle w:val="BodyText"/>
+      </w:pPr>
+      <w:r>
+        <w:t xml:space="preserve">In many instances, those officials responded to police incidents involving African- Americans by hastily charging the officer(s), in an effort to head off mob-fueled rioting. Luibrand, supra (“But just last week, a prosecutor was quick to charge a Univ. of Cincinnati police officer with the death of Samuel DuBose during a traffic stop in Ohio”); see also Sheryl Gay Stolberg and Alan Blinder, “Marilyn Mosby, Prosecutor in Freddie Gray Case, Takes a Stand and Calms a Troubled City,” The New York Times (May 1, 2015), available at https://​www.​nytimes.​com/​2015/​05/​02/​us/​marilyn-​mosby-​prosecutor-​in-​freddie-​gray-​case-​seen- as-tough-on-police-misconduct.html (accessed Feb. 20, 2017) (prosecutor announces charges against six Baltimore police officers less than two weeks after death of Freddie Gray and ensuing riots). Though such prosecutors appeased the mob and achieved transient political gain through the sacrifice of individual due-process rights, id., most of their ill-advised rushes to judgment culminated in acquittals and dropped charges. See, e.g., Sheryl Gay Stolberg and Jess Bidgood, “All Charges Dropped Against Baltimore Officers in Freddie Gray Case,” The New York Times (July 27, 2016), available at https://​www.​nytimes.​com/​2016/​07/​28/​us/​charges-​dropped-​against</w:t>
       </w:r>
       <w:r>
         <w:noBreakHyphen/>
@@ -1914,21 +1914,21 @@
         <w:pStyle w:val="BodyText"/>
       </w:pPr>
       <w:r>
-        <w:t xml:space="preserve">Oklahoma City in August 2014 was not immune to this phenomenon. Michael Brown was fatally shot by a white Ferguson officer on August 9, and by August 16, President Obama had ordered a federal investigation of the police department, Attorney General Eric Holder directed the FBI to conduct a separate autopsy, and Missouri Gov. Jay Nixon imposed a curfew and declared a state of emergency to quell the nightly unrest on Ferguson’s streets. Emily Wax- Thibodeaux, “Ferguson timeline: What’s happened since the Aug. 9 shooting of Michael Brown,” (Nov. 21, 2014), available at https://www.washingtonpost.com/​news/​post-nation/​wp/ 2014/11/21/​ferguson-timeline-whats-happened-since-the-aug</w:t>
+        <w:t xml:space="preserve">Oklahoma City in August 2014 was not immune to this phenomenon. Michael Brown was fatally shot by a white Ferguson officer on August 9, and by August 16, President Obama had ordered a federal investigation of the police department, Attorney General Eric Holder directed the FBI to conduct a separate autopsy, and Missouri Gov. Jay Nixon imposed a curfew and declared a state of emergency to quell the nightly unrest on Ferguson’s streets. Emily Wax- Thibodeaux, “Ferguson timeline: What’s happened since the Aug. 9 shooting of Michael Brown,” (Nov. 21, 2014), available at https://​www.​washingtonpost.​com/​news/​post-​nation/​wp/ 2014/11/21/​ferguson-timeline-whats-happened-since-the-aug</w:t>
       </w:r>
       <w:r>
         <w:noBreakHyphen/>
       </w:r>
       <w:r>
-        <w:t xml:space="preserve">9-shooting-of-michael- brown/?utm_term=.619317b0ec32 (accessed Feb. 22, 2017). Four days later, on Aug. 20, a crowd of around 100 activists gathered at the Capitol in Oklahoma City to protest Brown’s death and equate it with that of Luis Rodriguez, a 44-year-old Hispanic man who had died six months earlier in Moore, while being restrained by five officers who were not charged. Jennifer Palmer, “Oklahoma City speakers say police killing in Ferguson, Mo. could happen anywhere,” (Aug. 21, 2014), available at http://newsok.com/​article/5334467 (accessed Feb. 22, 2017).</w:t>
-      </w:r>
-    </w:p>
-    <w:p>
-      <w:pPr>
-        <w:pStyle w:val="BodyText"/>
-      </w:pPr>
-      <w:r>
-        <w:t xml:space="preserve">Against this backdrop of mounting political pressure and social agitation, including protests coordinated by a group called OKC Artists for Justice, police the very next day, Aug. 21, arrested Holtzclaw – who had been on administrative leave since June – and released his mugshot to the media. Matt Dinger, “Oklahoma City police officer is charged with rape, 14 other counts,” (Aug. 29, 2014), available at http://newsok.com/​article/5337168 (accessed Feb. 22, 2017). Prosecutors brought the first 15 charges against Holtzclaw on August 29, Id., and ultimately charged him with 36 offenses relating to 13 black women.</w:t>
+        <w:t xml:space="preserve">9-shooting-of-michael- brown/?utm_term=.619317b0ec32 (accessed Feb. 22, 2017). Four days later, on Aug. 20, a crowd of around 100 activists gathered at the Capitol in Oklahoma City to protest Brown’s death and equate it with that of Luis Rodriguez, a 44-year-old Hispanic man who had died six months earlier in Moore, while being restrained by five officers who were not charged. Jennifer Palmer, “Oklahoma City speakers say police killing in Ferguson, Mo. could happen anywhere,” (Aug. 21, 2014), available at http://​newsok.​com/​article/​5334467 (accessed Feb. 22, 2017).</w:t>
+      </w:r>
+    </w:p>
+    <w:p>
+      <w:pPr>
+        <w:pStyle w:val="BodyText"/>
+      </w:pPr>
+      <w:r>
+        <w:t xml:space="preserve">Against this backdrop of mounting political pressure and social agitation, including protests coordinated by a group called OKC Artists for Justice, police the very next day, Aug. 21, arrested Holtzclaw – who had been on administrative leave since June – and released his mugshot to the media. Matt Dinger, “Oklahoma City police officer is charged with rape, 14 other counts,” (Aug. 29, 2014), available at http://​newsok.​com/​article/​5337168 (accessed Feb. 22, 2017). Prosecutors brought the first 15 charges against Holtzclaw on August 29, Id., and ultimately charged him with 36 offenses relating to 13 black women.</w:t>
       </w:r>
     </w:p>
     <w:p>
@@ -2000,7 +2000,7 @@
         <w:pStyle w:val="BodyText"/>
       </w:pPr>
       <w:r>
-        <w:t xml:space="preserve">Lives Matter,” (Nov. 13, 2015), available at http://www.nbcnews.com/​news/</w:t>
+        <w:t xml:space="preserve">Lives Matter,” (Nov. 13, 2015), available at http://​www.​nbcnews.​com/​news/</w:t>
       </w:r>
     </w:p>
     <w:p>
@@ -2410,7 +2410,7 @@
         <w:noBreakHyphen/>
       </w:r>
       <w:r>
-        <w:t xml:space="preserve">06; see also Adam Snider, “High Volume of Chanting Protesters Interrupt Holtzclaw Trial,” (Nov. 17, 2015) available at http://kfor.com/2015/11/17/​chanting-protesters-interrupt-holtzclaw-trial/ (accessed Feb. 17, 2017). Their chants deliberately targeted the courtroom above:3</w:t>
+        <w:t xml:space="preserve">06; see also Adam Snider, “High Volume of Chanting Protesters Interrupt Holtzclaw Trial,” (Nov. 17, 2015) available at http://​kfor.​com/​2015/​11/​17/​chanting-​protesters-​interrupt-​holtzclaw-​trial/ (accessed Feb. 17, 2017). Their chants deliberately targeted the courtroom above:3</w:t>
       </w:r>
     </w:p>
     <w:p>
@@ -2424,7 +2424,7 @@
         <w:noBreakHyphen/>
       </w:r>
       <w:r>
-        <w:t xml:space="preserve">06; see also, Snider, supra, and Kyle Schwab, “Protesters chant outside Oklahoma County Courthouse during ex-officer’s sex crimes trial,” (Nov. 18, 2015) available at http://newsok.com/​article/5461162 (accessed Feb. 21, 2017) (“Whenever [OKC Artists for Justice leader Grace] Franklin yelled, ‘36 counts,’ the group shouted, ‘We want life!’”); Tom Uncredited photo from “Why Daniel Holtzclaw’s Conviction Matters,” available at http://empowering.hearst.co.uk/​be-informed/​why-daniel-holtzclaws-conviction-matters/, (accessed Feb. 23, 2017). George, “Group rallies outside Holtzclaw trial,” (Nov. 17, 2015), available at http://okcfox.com/ news/​local/​protesters-rally-outside-holtzclaw-trial (accessed Feb. 17, 2017) (“It was a message the jury and Holtzclaw were forced to hear Tuesday. The protesters chants echoed up to the second floor of the courtroom so loud that the judge had to stop and remind the jury not to let it impact their decision”). The protesters evidently had assistance from inside the courtroom, since their shouts suddenly stopped as defense counsel rose to object, or when the jury was out. TR 2303</w:t>
+        <w:t xml:space="preserve">06; see also, Snider, supra, and Kyle Schwab, “Protesters chant outside Oklahoma County Courthouse during ex-officer’s sex crimes trial,” (Nov. 18, 2015) available at http://​newsok.​com/​article/​5461162 (accessed Feb. 21, 2017) (“Whenever [OKC Artists for Justice leader Grace] Franklin yelled, ‘36 counts,’ the group shouted, ‘We want life!’”); Tom Uncredited photo from “Why Daniel Holtzclaw’s Conviction Matters,” available at http://​empowering.​hearst.​co.​uk/​be-​informed/​why-​daniel-​holtzclaws-​conviction-​matters/​, (accessed Feb. 23, 2017). George, “Group rallies outside Holtzclaw trial,” (Nov. 17, 2015), available at http://​okcfox.​com/ news/​local/​protesters-rally-outside-holtzclaw-trial (accessed Feb. 17, 2017) (“It was a message the jury and Holtzclaw were forced to hear Tuesday. The protesters chants echoed up to the second floor of the courtroom so loud that the judge had to stop and remind the jury not to let it impact their decision”). The protesters evidently had assistance from inside the courtroom, since their shouts suddenly stopped as defense counsel rose to object, or when the jury was out. TR 2303</w:t>
       </w:r>
       <w:r>
         <w:noBreakHyphen/>
@@ -2466,7 +2466,7 @@
         <w:pStyle w:val="BodyText"/>
       </w:pPr>
       <w:r>
-        <w:t xml:space="preserve">Even that did not fully satisfy the mob, however. As one New York City daily reported with evident satisfaction following the guilty verdicts, “[p]rotesters outside the Oklahoma courthouse sarcastically sang ‘Happy Birthday’ to the predator, who turned 29 Thursday.” Alfred Ng and Jason Silverstein, “Jury convicts ex-Oklahoma cop of rape, sodomy charges; faces life in prison,” (Dec. 11, 2015), available at http://www.nydailynews.com/​news/​crime/​jury- convicts-ex-oklahoma-rape-charges-article</w:t>
+        <w:t xml:space="preserve">Even that did not fully satisfy the mob, however. As one New York City daily reported with evident satisfaction following the guilty verdicts, “[p]rotesters outside the Oklahoma courthouse sarcastically sang ‘Happy Birthday’ to the predator, who turned 29 Thursday.” Alfred Ng and Jason Silverstein, “Jury convicts ex-Oklahoma cop of rape, sodomy charges; faces life in prison,” (Dec. 11, 2015), available at http://​www.​nydailynews.​com/​news/​crime/​jury- convicts-ex-oklahoma-rape-charges-article</w:t>
       </w:r>
       <w:r>
         <w:noBreakHyphen/>
@@ -4720,6 +4720,7 @@
     <w:unhideWhenUsed/>
     <w:qFormat/>
     <w:pPr>
+      <w:keepLines/>
       <w:spacing w:before="0" w:after="140" w:line="299" w:lineRule="exact"/>
     </w:pPr>
     <w:rPr>
@@ -4970,6 +4971,33 @@
     <w:pPr>
       <w:spacing w:before="0" w:after="0" w:line="299" w:lineRule="exact"/>
       <w:ind w:left="2160" w:hanging="720"/>
+    </w:pPr>
+  </w:style>
+  <w:style w:type="paragraph" w:customStyle="1" w:styleId="XdQuoteList1">
+    <w:name w:val="Xd Quote List 1"/>
+    <w:basedOn w:val="Normal"/>
+    <w:qFormat/>
+    <w:pPr>
+      <w:spacing w:before="0" w:after="0" w:line="299" w:lineRule="exact"/>
+      <w:ind w:left="1440" w:right="720" w:hanging="720"/>
+    </w:pPr>
+  </w:style>
+  <w:style w:type="paragraph" w:customStyle="1" w:styleId="XdQuoteList2">
+    <w:name w:val="Xd Quote List 2"/>
+    <w:basedOn w:val="Normal"/>
+    <w:qFormat/>
+    <w:pPr>
+      <w:spacing w:before="0" w:after="0" w:line="299" w:lineRule="exact"/>
+      <w:ind w:left="2160" w:right="720" w:hanging="720"/>
+    </w:pPr>
+  </w:style>
+  <w:style w:type="paragraph" w:customStyle="1" w:styleId="XdQuoteList3">
+    <w:name w:val="Xd Quote List 3"/>
+    <w:basedOn w:val="Normal"/>
+    <w:qFormat/>
+    <w:pPr>
+      <w:spacing w:before="0" w:after="0" w:line="299" w:lineRule="exact"/>
+      <w:ind w:left="2880" w:right="720" w:hanging="720"/>
     </w:pPr>
   </w:style>
   <w:style w:type="paragraph" w:customStyle="1" w:styleId="SourceCode">

</xml_diff>